<commit_message>
BRD-13 set rebuilt with the business wording of the archive details message and column (V1092); the pack check no longer allows the former technical message
</commit_message>
<xml_diff>
--- a/docs/deliverables/out/Drop-0_Setup_and_Data_Migration/BRD-13_Data_Migration/05_BIBS_TestPlan_BRD-13_Data_Migration_Summary_v2.0.docx
+++ b/docs/deliverables/out/Drop-0_Setup_and_Data_Migration/BRD-13_Data_Migration/05_BIBS_TestPlan_BRD-13_Data_Migration_Summary_v2.0.docx
@@ -6773,7 +6773,7 @@
               <w:rPr>
                 <w:sz w:val="17"/>
               </w:rPr>
-              <w:t>59</w:t>
+              <w:t>60</w:t>
             </w:r>
           </w:p>
         </w:tc>
@@ -9181,7 +9181,7 @@
               <w:rPr>
                 <w:sz w:val="18"/>
               </w:rPr>
-              <w:t>222</w:t>
+              <w:t>223</w:t>
             </w:r>
           </w:p>
         </w:tc>
@@ -9232,7 +9232,7 @@
               <w:rPr>
                 <w:sz w:val="18"/>
               </w:rPr>
-              <w:t>117 / 105</w:t>
+              <w:t>117 / 106</w:t>
             </w:r>
           </w:p>
         </w:tc>
@@ -9681,7 +9681,7 @@
               <w:rPr>
                 <w:sz w:val="18"/>
               </w:rPr>
-              <w:t>16</w:t>
+              <w:t>17</w:t>
             </w:r>
           </w:p>
         </w:tc>

</xml_diff>